<commit_message>
Alles muss raus: Künstlername Jette van Hoven, Impressum ohne Adresse
Co-Authored-By: Claude Opus 5.5 <noreply@anthropic.com>
Claude-Session: https://claude.ai/code/session_01Rqm6WzG9kWnhYjBnATSipi
</commit_message>
<xml_diff>
--- a/kdp-krimis/band-01-starnberg/Alles-muss-raus-Band-1-Mit-Seeblick-und-Leiche-KDP-Angaben.docx
+++ b/kdp-krimis/band-01-starnberg/Alles-muss-raus-Band-1-Mit-Seeblick-und-Leiche-KDP-Angaben.docx
@@ -126,7 +126,7 @@
           <w:b w:val="0"/>
           <w:i w:val="0"/>
         </w:rPr>
-        <w:t>Diana [Nachname oder Pseudonym]</w:t>
+        <w:t>Jette van Hoven</w:t>
       </w:r>
     </w:p>
     <w:p>
@@ -377,7 +377,7 @@
           <w:b w:val="0"/>
           <w:i w:val="0"/>
         </w:rPr>
-        <w:t>Diana schreibt Krimis mit Herz, Humor und echten Orten. Sie liebt Geschichten, in denen alte Dinge etwas erzählen, und Figuren, die man gern zum Kaffee einladen würde. Mit „Alles muss raus“ startet sie eine Reihe von Krimis zum Mitraten, die quer durch Deutschland führt.</w:t>
+        <w:t>Jette van Hoven schreibt Krimis mit Herz, Humor und echten Orten. Sie liebt Geschichten, in denen alte Dinge etwas erzählen, und Figuren, die man gern zum Kaffee einladen würde. Mit „Alles muss raus“ startet sie eine Reihe von Krimis zum Mitraten, die quer durch Deutschland führt.</w:t>
       </w:r>
     </w:p>
     <w:p>
@@ -488,7 +488,7 @@
           <w:b w:val="0"/>
           <w:i w:val="0"/>
         </w:rPr>
-        <w:t>1. Die Buchdatei in Word öffnen, deinen Namen und deine Adresse im Impressum eintragen, die Bilder einsetzen.</w:t>
+        <w:t>1. Die Buchdatei in Word öffnen, die Bilder einsetzen (das Impressum ist schon fertig).</w:t>
       </w:r>
     </w:p>
     <w:p>

</xml_diff>